<commit_message>
R2 reproducibility update: scripts, data, model & supplementary tables
Response to Reviewer 2 (RSM-2025-0110):

New scripts (code/):
- 01_compute_per_database_metrics.py: reproduces Supplementary Table S1
- 02_inspect_model_pipeline.py: verifies SMOTE pipeline (no data leakage)
- 03_reproduce_holdout_split.py: reproduces class distribution & hold-out split

New data:
- data/predictions/*.xlsx: per-database MLM + Human Reviewer labels (5 databases)
- data/ml_training/WoS_health_revised_MO.xlsx: WoS training data (695 records)
- data/Supplementary_Table_Per_Database_Metrics.xlsx: Table S1
- data/Supplementary_Table_S1_reproduced.xlsx: reproduced Table S1

New model:
- models/my_trained_model_Mig_review_with_SMOTE.joblib: imblearn Pipeline (TF-IDF + SMOTE + LR)

Updated:
- README.md: full R2 reproducibility documentation
- requirements.txt: actual dependencies
- prompts/Appendix B.docx: updated supplementary prompt materials
</commit_message>
<xml_diff>
--- a/prompts/Appendix B.docx
+++ b/prompts/Appendix B.docx
@@ -1,6 +1,6 @@
 
 <file path=word/document.xml><?xml version="1.0" encoding="utf-8"?>
-<w:document xmlns:wpc="http://schemas.microsoft.com/office/word/2010/wordprocessingCanvas" xmlns:cx="http://schemas.microsoft.com/office/drawing/2014/chartex" xmlns:cx1="http://schemas.microsoft.com/office/drawing/2015/9/8/chartex" xmlns:cx2="http://schemas.microsoft.com/office/drawing/2015/10/21/chartex" xmlns:cx3="http://schemas.microsoft.com/office/drawing/2016/5/9/chartex" xmlns:cx4="http://schemas.microsoft.com/office/drawing/2016/5/10/chartex" xmlns:cx5="http://schemas.microsoft.com/office/drawing/2016/5/11/chartex" xmlns:cx6="http://schemas.microsoft.com/office/drawing/2016/5/12/chartex" xmlns:cx7="http://schemas.microsoft.com/office/drawing/2016/5/13/chartex" xmlns:cx8="http://schemas.microsoft.com/office/drawing/2016/5/14/chartex" xmlns:mc="http://schemas.openxmlformats.org/markup-compatibility/2006" xmlns:aink="http://schemas.microsoft.com/office/drawing/2016/ink" xmlns:am3d="http://schemas.microsoft.com/office/drawing/2017/model3d" xmlns:o="urn:schemas-microsoft-com:office:office" xmlns:oel="http://schemas.microsoft.com/office/2019/extlst" xmlns:r="http://schemas.openxmlformats.org/officeDocument/2006/relationships" xmlns:m="http://schemas.openxmlformats.org/officeDocument/2006/math" xmlns:v="urn:schemas-microsoft-com:vml" xmlns:wp14="http://schemas.microsoft.com/office/word/2010/wordprocessingDrawing" xmlns:wp="http://schemas.openxmlformats.org/drawingml/2006/wordprocessingDrawing" xmlns:w10="urn:schemas-microsoft-com:office:word" xmlns:w="http://schemas.openxmlformats.org/wordprocessingml/2006/main" xmlns:w14="http://schemas.microsoft.com/office/word/2010/wordml" xmlns:w15="http://schemas.microsoft.com/office/word/2012/wordml" xmlns:w16cex="http://schemas.microsoft.com/office/word/2018/wordml/cex" xmlns:w16cid="http://schemas.microsoft.com/office/word/2016/wordml/cid" xmlns:w16="http://schemas.microsoft.com/office/word/2018/wordml" xmlns:w16du="http://schemas.microsoft.com/office/word/2023/wordml/word16du" xmlns:w16sdtdh="http://schemas.microsoft.com/office/word/2020/wordml/sdtdatahash" xmlns:w16se="http://schemas.microsoft.com/office/word/2015/wordml/symex" xmlns:wpg="http://schemas.microsoft.com/office/word/2010/wordprocessingGroup" xmlns:wpi="http://schemas.microsoft.com/office/word/2010/wordprocessingInk" xmlns:wne="http://schemas.microsoft.com/office/word/2006/wordml" xmlns:wps="http://schemas.microsoft.com/office/word/2010/wordprocessingShape" mc:Ignorable="w14 w15 w16se w16cid w16 w16cex w16sdtdh w16du wp14">
+<w:document xmlns:wpc="http://schemas.microsoft.com/office/word/2010/wordprocessingCanvas" xmlns:cx="http://schemas.microsoft.com/office/drawing/2014/chartex" xmlns:cx1="http://schemas.microsoft.com/office/drawing/2015/9/8/chartex" xmlns:cx2="http://schemas.microsoft.com/office/drawing/2015/10/21/chartex" xmlns:cx3="http://schemas.microsoft.com/office/drawing/2016/5/9/chartex" xmlns:cx4="http://schemas.microsoft.com/office/drawing/2016/5/10/chartex" xmlns:cx5="http://schemas.microsoft.com/office/drawing/2016/5/11/chartex" xmlns:cx6="http://schemas.microsoft.com/office/drawing/2016/5/12/chartex" xmlns:cx7="http://schemas.microsoft.com/office/drawing/2016/5/13/chartex" xmlns:cx8="http://schemas.microsoft.com/office/drawing/2016/5/14/chartex" xmlns:mc="http://schemas.openxmlformats.org/markup-compatibility/2006" xmlns:aink="http://schemas.microsoft.com/office/drawing/2016/ink" xmlns:am3d="http://schemas.microsoft.com/office/drawing/2017/model3d" xmlns:o="urn:schemas-microsoft-com:office:office" xmlns:oel="http://schemas.microsoft.com/office/2019/extlst" xmlns:r="http://schemas.openxmlformats.org/officeDocument/2006/relationships" xmlns:m="http://schemas.openxmlformats.org/officeDocument/2006/math" xmlns:v="urn:schemas-microsoft-com:vml" xmlns:wp14="http://schemas.microsoft.com/office/word/2010/wordprocessingDrawing" xmlns:wp="http://schemas.openxmlformats.org/drawingml/2006/wordprocessingDrawing" xmlns:w10="urn:schemas-microsoft-com:office:word" xmlns:w="http://schemas.openxmlformats.org/wordprocessingml/2006/main" xmlns:w14="http://schemas.microsoft.com/office/word/2010/wordml" xmlns:w15="http://schemas.microsoft.com/office/word/2012/wordml" xmlns:w16cex="http://schemas.microsoft.com/office/word/2018/wordml/cex" xmlns:w16cid="http://schemas.microsoft.com/office/word/2016/wordml/cid" xmlns:w16="http://schemas.microsoft.com/office/word/2018/wordml" xmlns:w16du="http://schemas.microsoft.com/office/word/2023/wordml/word16du" xmlns:w16sdtdh="http://schemas.microsoft.com/office/word/2020/wordml/sdtdatahash" xmlns:w16sdtfl="http://schemas.microsoft.com/office/word/2024/wordml/sdtformatlock" xmlns:w16se="http://schemas.microsoft.com/office/word/2015/wordml/symex" xmlns:wpg="http://schemas.microsoft.com/office/word/2010/wordprocessingGroup" xmlns:wpi="http://schemas.microsoft.com/office/word/2010/wordprocessingInk" xmlns:wne="http://schemas.microsoft.com/office/word/2006/wordml" xmlns:wps="http://schemas.microsoft.com/office/word/2010/wordprocessingShape" mc:Ignorable="w14 w15 w16se w16cid w16 w16cex w16sdtdh w16sdtfl w16du wp14">
   <w:body>
     <w:p>
       <w:pPr>
@@ -535,6 +535,2234 @@
         </w:drawing>
       </w:r>
     </w:p>
+    <w:p>
+      <w:pPr>
+        <w:rPr>
+          <w:lang w:val="en-US"/>
+        </w:rPr>
+      </w:pPr>
+    </w:p>
+    <w:p>
+      <w:pPr>
+        <w:rPr>
+          <w:lang w:val="en-US"/>
+        </w:rPr>
+      </w:pPr>
+    </w:p>
+    <w:p>
+      <w:pPr>
+        <w:rPr>
+          <w:b/>
+          <w:bCs/>
+        </w:rPr>
+      </w:pPr>
+      <w:r>
+        <w:rPr>
+          <w:b/>
+          <w:bCs/>
+        </w:rPr>
+        <w:t>T</w:t>
+      </w:r>
+      <w:r>
+        <w:rPr>
+          <w:b/>
+          <w:bCs/>
+        </w:rPr>
+        <w:t>raining script</w:t>
+      </w:r>
+    </w:p>
+    <w:p>
+      <w:pPr>
+        <w:rPr>
+          <w:b/>
+          <w:bCs/>
+        </w:rPr>
+      </w:pPr>
+    </w:p>
+    <w:p>
+      <w:pPr>
+        <w:rPr>
+          <w:i/>
+          <w:iCs/>
+          <w:lang w:val="en-US"/>
+        </w:rPr>
+      </w:pPr>
+      <w:r>
+        <w:rPr>
+          <w:i/>
+          <w:iCs/>
+          <w:lang w:val="en-US"/>
+        </w:rPr>
+        <w:t>import pandas as pd</w:t>
+      </w:r>
+    </w:p>
+    <w:p>
+      <w:pPr>
+        <w:rPr>
+          <w:i/>
+          <w:iCs/>
+          <w:lang w:val="en-US"/>
+        </w:rPr>
+      </w:pPr>
+      <w:r>
+        <w:rPr>
+          <w:i/>
+          <w:iCs/>
+          <w:lang w:val="en-US"/>
+        </w:rPr>
+        <w:t xml:space="preserve">from </w:t>
+      </w:r>
+      <w:proofErr w:type="spellStart"/>
+      <w:proofErr w:type="gramStart"/>
+      <w:r>
+        <w:rPr>
+          <w:i/>
+          <w:iCs/>
+          <w:lang w:val="en-US"/>
+        </w:rPr>
+        <w:t>sklearn.model</w:t>
+      </w:r>
+      <w:proofErr w:type="gramEnd"/>
+      <w:r>
+        <w:rPr>
+          <w:i/>
+          <w:iCs/>
+          <w:lang w:val="en-US"/>
+        </w:rPr>
+        <w:t>_selection</w:t>
+      </w:r>
+      <w:proofErr w:type="spellEnd"/>
+      <w:r>
+        <w:rPr>
+          <w:i/>
+          <w:iCs/>
+          <w:lang w:val="en-US"/>
+        </w:rPr>
+        <w:t xml:space="preserve"> import </w:t>
+      </w:r>
+      <w:proofErr w:type="spellStart"/>
+      <w:r>
+        <w:rPr>
+          <w:i/>
+          <w:iCs/>
+          <w:lang w:val="en-US"/>
+        </w:rPr>
+        <w:t>train_test_split</w:t>
+      </w:r>
+      <w:proofErr w:type="spellEnd"/>
+    </w:p>
+    <w:p>
+      <w:pPr>
+        <w:rPr>
+          <w:i/>
+          <w:iCs/>
+          <w:lang w:val="en-US"/>
+        </w:rPr>
+      </w:pPr>
+      <w:r>
+        <w:rPr>
+          <w:i/>
+          <w:iCs/>
+          <w:lang w:val="en-US"/>
+        </w:rPr>
+        <w:t xml:space="preserve">from </w:t>
+      </w:r>
+      <w:proofErr w:type="spellStart"/>
+      <w:proofErr w:type="gramStart"/>
+      <w:r>
+        <w:rPr>
+          <w:i/>
+          <w:iCs/>
+          <w:lang w:val="en-US"/>
+        </w:rPr>
+        <w:t>sklearn.feature</w:t>
+      </w:r>
+      <w:proofErr w:type="gramEnd"/>
+      <w:r>
+        <w:rPr>
+          <w:i/>
+          <w:iCs/>
+          <w:lang w:val="en-US"/>
+        </w:rPr>
+        <w:t>_extraction.text</w:t>
+      </w:r>
+      <w:proofErr w:type="spellEnd"/>
+      <w:r>
+        <w:rPr>
+          <w:i/>
+          <w:iCs/>
+          <w:lang w:val="en-US"/>
+        </w:rPr>
+        <w:t xml:space="preserve"> import </w:t>
+      </w:r>
+      <w:proofErr w:type="spellStart"/>
+      <w:r>
+        <w:rPr>
+          <w:i/>
+          <w:iCs/>
+          <w:lang w:val="en-US"/>
+        </w:rPr>
+        <w:t>TfidfVectorizer</w:t>
+      </w:r>
+      <w:proofErr w:type="spellEnd"/>
+    </w:p>
+    <w:p>
+      <w:pPr>
+        <w:rPr>
+          <w:i/>
+          <w:iCs/>
+          <w:lang w:val="en-US"/>
+        </w:rPr>
+      </w:pPr>
+      <w:r>
+        <w:rPr>
+          <w:i/>
+          <w:iCs/>
+          <w:lang w:val="en-US"/>
+        </w:rPr>
+        <w:t xml:space="preserve">from </w:t>
+      </w:r>
+      <w:proofErr w:type="spellStart"/>
+      <w:proofErr w:type="gramStart"/>
+      <w:r>
+        <w:rPr>
+          <w:i/>
+          <w:iCs/>
+          <w:lang w:val="en-US"/>
+        </w:rPr>
+        <w:t>sklearn.linear</w:t>
+      </w:r>
+      <w:proofErr w:type="gramEnd"/>
+      <w:r>
+        <w:rPr>
+          <w:i/>
+          <w:iCs/>
+          <w:lang w:val="en-US"/>
+        </w:rPr>
+        <w:t>_model</w:t>
+      </w:r>
+      <w:proofErr w:type="spellEnd"/>
+      <w:r>
+        <w:rPr>
+          <w:i/>
+          <w:iCs/>
+          <w:lang w:val="en-US"/>
+        </w:rPr>
+        <w:t xml:space="preserve"> import </w:t>
+      </w:r>
+      <w:proofErr w:type="spellStart"/>
+      <w:r>
+        <w:rPr>
+          <w:i/>
+          <w:iCs/>
+          <w:lang w:val="en-US"/>
+        </w:rPr>
+        <w:t>LogisticRegression</w:t>
+      </w:r>
+      <w:proofErr w:type="spellEnd"/>
+    </w:p>
+    <w:p>
+      <w:pPr>
+        <w:rPr>
+          <w:i/>
+          <w:iCs/>
+          <w:lang w:val="en-US"/>
+        </w:rPr>
+      </w:pPr>
+      <w:r>
+        <w:rPr>
+          <w:i/>
+          <w:iCs/>
+          <w:lang w:val="en-US"/>
+        </w:rPr>
+        <w:t xml:space="preserve">from </w:t>
+      </w:r>
+      <w:proofErr w:type="spellStart"/>
+      <w:proofErr w:type="gramStart"/>
+      <w:r>
+        <w:rPr>
+          <w:i/>
+          <w:iCs/>
+          <w:lang w:val="en-US"/>
+        </w:rPr>
+        <w:t>imblearn.over</w:t>
+      </w:r>
+      <w:proofErr w:type="gramEnd"/>
+      <w:r>
+        <w:rPr>
+          <w:i/>
+          <w:iCs/>
+          <w:lang w:val="en-US"/>
+        </w:rPr>
+        <w:t>_sampling</w:t>
+      </w:r>
+      <w:proofErr w:type="spellEnd"/>
+      <w:r>
+        <w:rPr>
+          <w:i/>
+          <w:iCs/>
+          <w:lang w:val="en-US"/>
+        </w:rPr>
+        <w:t xml:space="preserve"> import SMOTE</w:t>
+      </w:r>
+    </w:p>
+    <w:p>
+      <w:pPr>
+        <w:rPr>
+          <w:i/>
+          <w:iCs/>
+          <w:lang w:val="en-US"/>
+        </w:rPr>
+      </w:pPr>
+      <w:r>
+        <w:rPr>
+          <w:i/>
+          <w:iCs/>
+          <w:lang w:val="en-US"/>
+        </w:rPr>
+        <w:t xml:space="preserve">from </w:t>
+      </w:r>
+      <w:proofErr w:type="spellStart"/>
+      <w:proofErr w:type="gramStart"/>
+      <w:r>
+        <w:rPr>
+          <w:i/>
+          <w:iCs/>
+          <w:lang w:val="en-US"/>
+        </w:rPr>
+        <w:t>imblearn.pipeline</w:t>
+      </w:r>
+      <w:proofErr w:type="spellEnd"/>
+      <w:proofErr w:type="gramEnd"/>
+      <w:r>
+        <w:rPr>
+          <w:i/>
+          <w:iCs/>
+          <w:lang w:val="en-US"/>
+        </w:rPr>
+        <w:t xml:space="preserve"> import </w:t>
+      </w:r>
+      <w:proofErr w:type="spellStart"/>
+      <w:r>
+        <w:rPr>
+          <w:i/>
+          <w:iCs/>
+          <w:lang w:val="en-US"/>
+        </w:rPr>
+        <w:t>make_pipeline</w:t>
+      </w:r>
+      <w:proofErr w:type="spellEnd"/>
+      <w:r>
+        <w:rPr>
+          <w:i/>
+          <w:iCs/>
+          <w:lang w:val="en-US"/>
+        </w:rPr>
+        <w:t xml:space="preserve"> as </w:t>
+      </w:r>
+      <w:proofErr w:type="spellStart"/>
+      <w:r>
+        <w:rPr>
+          <w:i/>
+          <w:iCs/>
+          <w:lang w:val="en-US"/>
+        </w:rPr>
+        <w:t>make_pipeline_</w:t>
+      </w:r>
+      <w:proofErr w:type="gramStart"/>
+      <w:r>
+        <w:rPr>
+          <w:i/>
+          <w:iCs/>
+          <w:lang w:val="en-US"/>
+        </w:rPr>
+        <w:t>imb</w:t>
+      </w:r>
+      <w:proofErr w:type="spellEnd"/>
+      <w:r>
+        <w:rPr>
+          <w:i/>
+          <w:iCs/>
+          <w:lang w:val="en-US"/>
+        </w:rPr>
+        <w:t xml:space="preserve">  #</w:t>
+      </w:r>
+      <w:proofErr w:type="gramEnd"/>
+      <w:r>
+        <w:rPr>
+          <w:i/>
+          <w:iCs/>
+          <w:lang w:val="en-US"/>
+        </w:rPr>
+        <w:t xml:space="preserve"> Use imbalanced-learn pipeline</w:t>
+      </w:r>
+    </w:p>
+    <w:p>
+      <w:pPr>
+        <w:rPr>
+          <w:i/>
+          <w:iCs/>
+          <w:lang w:val="en-US"/>
+        </w:rPr>
+      </w:pPr>
+      <w:r>
+        <w:rPr>
+          <w:i/>
+          <w:iCs/>
+          <w:lang w:val="en-US"/>
+        </w:rPr>
+        <w:t xml:space="preserve">from </w:t>
+      </w:r>
+      <w:proofErr w:type="spellStart"/>
+      <w:proofErr w:type="gramStart"/>
+      <w:r>
+        <w:rPr>
+          <w:i/>
+          <w:iCs/>
+          <w:lang w:val="en-US"/>
+        </w:rPr>
+        <w:t>sklearn.metrics</w:t>
+      </w:r>
+      <w:proofErr w:type="spellEnd"/>
+      <w:proofErr w:type="gramEnd"/>
+      <w:r>
+        <w:rPr>
+          <w:i/>
+          <w:iCs/>
+          <w:lang w:val="en-US"/>
+        </w:rPr>
+        <w:t xml:space="preserve"> import </w:t>
+      </w:r>
+      <w:proofErr w:type="spellStart"/>
+      <w:r>
+        <w:rPr>
+          <w:i/>
+          <w:iCs/>
+          <w:lang w:val="en-US"/>
+        </w:rPr>
+        <w:t>accuracy_score</w:t>
+      </w:r>
+      <w:proofErr w:type="spellEnd"/>
+      <w:r>
+        <w:rPr>
+          <w:i/>
+          <w:iCs/>
+          <w:lang w:val="en-US"/>
+        </w:rPr>
+        <w:t xml:space="preserve">, </w:t>
+      </w:r>
+      <w:proofErr w:type="spellStart"/>
+      <w:r>
+        <w:rPr>
+          <w:i/>
+          <w:iCs/>
+          <w:lang w:val="en-US"/>
+        </w:rPr>
+        <w:t>classification_report</w:t>
+      </w:r>
+      <w:proofErr w:type="spellEnd"/>
+    </w:p>
+    <w:p>
+      <w:pPr>
+        <w:rPr>
+          <w:i/>
+          <w:iCs/>
+          <w:lang w:val="en-US"/>
+        </w:rPr>
+      </w:pPr>
+      <w:r>
+        <w:rPr>
+          <w:i/>
+          <w:iCs/>
+          <w:lang w:val="en-US"/>
+        </w:rPr>
+        <w:t xml:space="preserve">from </w:t>
+      </w:r>
+      <w:proofErr w:type="spellStart"/>
+      <w:r>
+        <w:rPr>
+          <w:i/>
+          <w:iCs/>
+          <w:lang w:val="en-US"/>
+        </w:rPr>
+        <w:t>joblib</w:t>
+      </w:r>
+      <w:proofErr w:type="spellEnd"/>
+      <w:r>
+        <w:rPr>
+          <w:i/>
+          <w:iCs/>
+          <w:lang w:val="en-US"/>
+        </w:rPr>
+        <w:t xml:space="preserve"> import dump</w:t>
+      </w:r>
+    </w:p>
+    <w:p>
+      <w:pPr>
+        <w:rPr>
+          <w:i/>
+          <w:iCs/>
+          <w:lang w:val="en-US"/>
+        </w:rPr>
+      </w:pPr>
+    </w:p>
+    <w:p>
+      <w:pPr>
+        <w:rPr>
+          <w:i/>
+          <w:iCs/>
+          <w:lang w:val="en-US"/>
+        </w:rPr>
+      </w:pPr>
+      <w:r>
+        <w:rPr>
+          <w:i/>
+          <w:iCs/>
+          <w:lang w:val="en-US"/>
+        </w:rPr>
+        <w:t xml:space="preserve"># Load the </w:t>
+      </w:r>
+      <w:proofErr w:type="spellStart"/>
+      <w:r>
+        <w:rPr>
+          <w:i/>
+          <w:iCs/>
+          <w:lang w:val="en-US"/>
+        </w:rPr>
+        <w:t>WoS</w:t>
+      </w:r>
+      <w:proofErr w:type="spellEnd"/>
+      <w:r>
+        <w:rPr>
+          <w:i/>
+          <w:iCs/>
+          <w:lang w:val="en-US"/>
+        </w:rPr>
+        <w:t xml:space="preserve"> data</w:t>
+      </w:r>
+    </w:p>
+    <w:p>
+      <w:pPr>
+        <w:rPr>
+          <w:i/>
+          <w:iCs/>
+          <w:lang w:val="en-US"/>
+        </w:rPr>
+      </w:pPr>
+      <w:proofErr w:type="spellStart"/>
+      <w:r>
+        <w:rPr>
+          <w:i/>
+          <w:iCs/>
+          <w:lang w:val="en-US"/>
+        </w:rPr>
+        <w:t>wos_health_df</w:t>
+      </w:r>
+      <w:proofErr w:type="spellEnd"/>
+      <w:r>
+        <w:rPr>
+          <w:i/>
+          <w:iCs/>
+          <w:lang w:val="en-US"/>
+        </w:rPr>
+        <w:t xml:space="preserve"> = </w:t>
+      </w:r>
+      <w:proofErr w:type="gramStart"/>
+      <w:r>
+        <w:rPr>
+          <w:i/>
+          <w:iCs/>
+          <w:lang w:val="en-US"/>
+        </w:rPr>
+        <w:t>pd.read</w:t>
+      </w:r>
+      <w:proofErr w:type="gramEnd"/>
+      <w:r>
+        <w:rPr>
+          <w:i/>
+          <w:iCs/>
+          <w:lang w:val="en-US"/>
+        </w:rPr>
+        <w:t>_</w:t>
+      </w:r>
+      <w:proofErr w:type="gramStart"/>
+      <w:r>
+        <w:rPr>
+          <w:i/>
+          <w:iCs/>
+          <w:lang w:val="en-US"/>
+        </w:rPr>
+        <w:t>excel(</w:t>
+      </w:r>
+      <w:proofErr w:type="gramEnd"/>
+      <w:r>
+        <w:rPr>
+          <w:i/>
+          <w:iCs/>
+          <w:lang w:val="en-US"/>
+        </w:rPr>
+        <w:t xml:space="preserve">'/Users/migueloliveira/Documents/Mig_projects/Synthetic_data_projects/Model HR_NHR/WoS_health_revised_MO.xlsx', </w:t>
+      </w:r>
+      <w:proofErr w:type="spellStart"/>
+      <w:r>
+        <w:rPr>
+          <w:i/>
+          <w:iCs/>
+          <w:lang w:val="en-US"/>
+        </w:rPr>
+        <w:t>skiprows</w:t>
+      </w:r>
+      <w:proofErr w:type="spellEnd"/>
+      <w:r>
+        <w:rPr>
+          <w:i/>
+          <w:iCs/>
+          <w:lang w:val="en-US"/>
+        </w:rPr>
+        <w:t>=1)</w:t>
+      </w:r>
+    </w:p>
+    <w:p>
+      <w:pPr>
+        <w:rPr>
+          <w:i/>
+          <w:iCs/>
+          <w:lang w:val="en-US"/>
+        </w:rPr>
+      </w:pPr>
+    </w:p>
+    <w:p>
+      <w:pPr>
+        <w:rPr>
+          <w:i/>
+          <w:iCs/>
+          <w:lang w:val="en-US"/>
+        </w:rPr>
+      </w:pPr>
+      <w:r>
+        <w:rPr>
+          <w:i/>
+          <w:iCs/>
+          <w:lang w:val="en-US"/>
+        </w:rPr>
+        <w:t># Assign correct column names</w:t>
+      </w:r>
+    </w:p>
+    <w:p>
+      <w:pPr>
+        <w:rPr>
+          <w:i/>
+          <w:iCs/>
+          <w:lang w:val="en-US"/>
+        </w:rPr>
+      </w:pPr>
+      <w:proofErr w:type="spellStart"/>
+      <w:r>
+        <w:rPr>
+          <w:i/>
+          <w:iCs/>
+          <w:lang w:val="en-US"/>
+        </w:rPr>
+        <w:t>wos_health_</w:t>
+      </w:r>
+      <w:proofErr w:type="gramStart"/>
+      <w:r>
+        <w:rPr>
+          <w:i/>
+          <w:iCs/>
+          <w:lang w:val="en-US"/>
+        </w:rPr>
+        <w:t>df.columns</w:t>
+      </w:r>
+      <w:proofErr w:type="spellEnd"/>
+      <w:proofErr w:type="gramEnd"/>
+      <w:r>
+        <w:rPr>
+          <w:i/>
+          <w:iCs/>
+          <w:lang w:val="en-US"/>
+        </w:rPr>
+        <w:t xml:space="preserve"> = ['Authors', 'Title', 'Abstract', 'Year', 'Mig Review', 'GPT4 Review']</w:t>
+      </w:r>
+    </w:p>
+    <w:p>
+      <w:pPr>
+        <w:rPr>
+          <w:i/>
+          <w:iCs/>
+          <w:lang w:val="en-US"/>
+        </w:rPr>
+      </w:pPr>
+    </w:p>
+    <w:p>
+      <w:pPr>
+        <w:rPr>
+          <w:i/>
+          <w:iCs/>
+          <w:lang w:val="en-US"/>
+        </w:rPr>
+      </w:pPr>
+      <w:r>
+        <w:rPr>
+          <w:i/>
+          <w:iCs/>
+          <w:lang w:val="en-US"/>
+        </w:rPr>
+        <w:t># Encode the 'Mig Review' column</w:t>
+      </w:r>
+    </w:p>
+    <w:p>
+      <w:pPr>
+        <w:rPr>
+          <w:i/>
+          <w:iCs/>
+          <w:lang w:val="en-US"/>
+        </w:rPr>
+      </w:pPr>
+      <w:proofErr w:type="spellStart"/>
+      <w:r>
+        <w:rPr>
+          <w:i/>
+          <w:iCs/>
+          <w:lang w:val="en-US"/>
+        </w:rPr>
+        <w:t>wos_health_df</w:t>
+      </w:r>
+      <w:proofErr w:type="spellEnd"/>
+      <w:r>
+        <w:rPr>
+          <w:i/>
+          <w:iCs/>
+          <w:lang w:val="en-US"/>
+        </w:rPr>
+        <w:t xml:space="preserve">['Label'] = </w:t>
+      </w:r>
+      <w:proofErr w:type="spellStart"/>
+      <w:r>
+        <w:rPr>
+          <w:i/>
+          <w:iCs/>
+          <w:lang w:val="en-US"/>
+        </w:rPr>
+        <w:t>wos_health_</w:t>
+      </w:r>
+      <w:proofErr w:type="gramStart"/>
+      <w:r>
+        <w:rPr>
+          <w:i/>
+          <w:iCs/>
+          <w:lang w:val="en-US"/>
+        </w:rPr>
+        <w:t>df</w:t>
+      </w:r>
+      <w:proofErr w:type="spellEnd"/>
+      <w:r>
+        <w:rPr>
+          <w:i/>
+          <w:iCs/>
+          <w:lang w:val="en-US"/>
+        </w:rPr>
+        <w:t>[</w:t>
+      </w:r>
+      <w:proofErr w:type="gramEnd"/>
+      <w:r>
+        <w:rPr>
+          <w:i/>
+          <w:iCs/>
+          <w:lang w:val="en-US"/>
+        </w:rPr>
+        <w:t>'Mig Review'</w:t>
+      </w:r>
+      <w:proofErr w:type="gramStart"/>
+      <w:r>
+        <w:rPr>
+          <w:i/>
+          <w:iCs/>
+          <w:lang w:val="en-US"/>
+        </w:rPr>
+        <w:t>].apply</w:t>
+      </w:r>
+      <w:proofErr w:type="gramEnd"/>
+      <w:r>
+        <w:rPr>
+          <w:i/>
+          <w:iCs/>
+          <w:lang w:val="en-US"/>
+        </w:rPr>
+        <w:t>(lambda x: 1 if 'Health related' in x else 0)</w:t>
+      </w:r>
+    </w:p>
+    <w:p>
+      <w:pPr>
+        <w:rPr>
+          <w:i/>
+          <w:iCs/>
+          <w:lang w:val="en-US"/>
+        </w:rPr>
+      </w:pPr>
+    </w:p>
+    <w:p>
+      <w:pPr>
+        <w:rPr>
+          <w:i/>
+          <w:iCs/>
+          <w:lang w:val="en-US"/>
+        </w:rPr>
+      </w:pPr>
+      <w:r>
+        <w:rPr>
+          <w:i/>
+          <w:iCs/>
+          <w:lang w:val="en-US"/>
+        </w:rPr>
+        <w:t># Drop unnecessary columns</w:t>
+      </w:r>
+    </w:p>
+    <w:p>
+      <w:pPr>
+        <w:rPr>
+          <w:i/>
+          <w:iCs/>
+          <w:lang w:val="en-US"/>
+        </w:rPr>
+      </w:pPr>
+      <w:proofErr w:type="spellStart"/>
+      <w:r>
+        <w:rPr>
+          <w:i/>
+          <w:iCs/>
+          <w:lang w:val="en-US"/>
+        </w:rPr>
+        <w:t>wos_health_df</w:t>
+      </w:r>
+      <w:proofErr w:type="spellEnd"/>
+      <w:r>
+        <w:rPr>
+          <w:i/>
+          <w:iCs/>
+          <w:lang w:val="en-US"/>
+        </w:rPr>
+        <w:t xml:space="preserve"> = </w:t>
+      </w:r>
+      <w:proofErr w:type="spellStart"/>
+      <w:r>
+        <w:rPr>
+          <w:i/>
+          <w:iCs/>
+          <w:lang w:val="en-US"/>
+        </w:rPr>
+        <w:t>wos_health_</w:t>
+      </w:r>
+      <w:proofErr w:type="gramStart"/>
+      <w:r>
+        <w:rPr>
+          <w:i/>
+          <w:iCs/>
+          <w:lang w:val="en-US"/>
+        </w:rPr>
+        <w:t>df.drop</w:t>
+      </w:r>
+      <w:proofErr w:type="spellEnd"/>
+      <w:proofErr w:type="gramEnd"/>
+      <w:r>
+        <w:rPr>
+          <w:i/>
+          <w:iCs/>
+          <w:lang w:val="en-US"/>
+        </w:rPr>
+        <w:t>(['Mig Review', 'GPT4 Review'], axis=1)</w:t>
+      </w:r>
+    </w:p>
+    <w:p>
+      <w:pPr>
+        <w:rPr>
+          <w:i/>
+          <w:iCs/>
+          <w:lang w:val="en-US"/>
+        </w:rPr>
+      </w:pPr>
+    </w:p>
+    <w:p>
+      <w:pPr>
+        <w:rPr>
+          <w:i/>
+          <w:iCs/>
+          <w:lang w:val="en-US"/>
+        </w:rPr>
+      </w:pPr>
+      <w:r>
+        <w:rPr>
+          <w:i/>
+          <w:iCs/>
+          <w:lang w:val="en-US"/>
+        </w:rPr>
+        <w:t># Split the data into training and testing sets</w:t>
+      </w:r>
+    </w:p>
+    <w:p>
+      <w:pPr>
+        <w:rPr>
+          <w:i/>
+          <w:iCs/>
+          <w:lang w:val="en-US"/>
+        </w:rPr>
+      </w:pPr>
+      <w:proofErr w:type="spellStart"/>
+      <w:r>
+        <w:rPr>
+          <w:i/>
+          <w:iCs/>
+          <w:lang w:val="en-US"/>
+        </w:rPr>
+        <w:t>X_train</w:t>
+      </w:r>
+      <w:proofErr w:type="spellEnd"/>
+      <w:r>
+        <w:rPr>
+          <w:i/>
+          <w:iCs/>
+          <w:lang w:val="en-US"/>
+        </w:rPr>
+        <w:t xml:space="preserve">, </w:t>
+      </w:r>
+      <w:proofErr w:type="spellStart"/>
+      <w:r>
+        <w:rPr>
+          <w:i/>
+          <w:iCs/>
+          <w:lang w:val="en-US"/>
+        </w:rPr>
+        <w:t>X_test</w:t>
+      </w:r>
+      <w:proofErr w:type="spellEnd"/>
+      <w:r>
+        <w:rPr>
+          <w:i/>
+          <w:iCs/>
+          <w:lang w:val="en-US"/>
+        </w:rPr>
+        <w:t xml:space="preserve">, </w:t>
+      </w:r>
+      <w:proofErr w:type="spellStart"/>
+      <w:r>
+        <w:rPr>
+          <w:i/>
+          <w:iCs/>
+          <w:lang w:val="en-US"/>
+        </w:rPr>
+        <w:t>y_train</w:t>
+      </w:r>
+      <w:proofErr w:type="spellEnd"/>
+      <w:r>
+        <w:rPr>
+          <w:i/>
+          <w:iCs/>
+          <w:lang w:val="en-US"/>
+        </w:rPr>
+        <w:t xml:space="preserve">, </w:t>
+      </w:r>
+      <w:proofErr w:type="spellStart"/>
+      <w:r>
+        <w:rPr>
+          <w:i/>
+          <w:iCs/>
+          <w:lang w:val="en-US"/>
+        </w:rPr>
+        <w:t>y_test</w:t>
+      </w:r>
+      <w:proofErr w:type="spellEnd"/>
+      <w:r>
+        <w:rPr>
+          <w:i/>
+          <w:iCs/>
+          <w:lang w:val="en-US"/>
+        </w:rPr>
+        <w:t xml:space="preserve"> = </w:t>
+      </w:r>
+      <w:proofErr w:type="spellStart"/>
+      <w:r>
+        <w:rPr>
+          <w:i/>
+          <w:iCs/>
+          <w:lang w:val="en-US"/>
+        </w:rPr>
+        <w:t>train_test_</w:t>
+      </w:r>
+      <w:proofErr w:type="gramStart"/>
+      <w:r>
+        <w:rPr>
+          <w:i/>
+          <w:iCs/>
+          <w:lang w:val="en-US"/>
+        </w:rPr>
+        <w:t>split</w:t>
+      </w:r>
+      <w:proofErr w:type="spellEnd"/>
+      <w:r>
+        <w:rPr>
+          <w:i/>
+          <w:iCs/>
+          <w:lang w:val="en-US"/>
+        </w:rPr>
+        <w:t>(</w:t>
+      </w:r>
+      <w:proofErr w:type="gramEnd"/>
+    </w:p>
+    <w:p>
+      <w:pPr>
+        <w:rPr>
+          <w:i/>
+          <w:iCs/>
+          <w:lang w:val="en-US"/>
+        </w:rPr>
+      </w:pPr>
+      <w:r>
+        <w:rPr>
+          <w:i/>
+          <w:iCs/>
+          <w:lang w:val="en-US"/>
+        </w:rPr>
+        <w:t xml:space="preserve">    </w:t>
+      </w:r>
+      <w:proofErr w:type="spellStart"/>
+      <w:r>
+        <w:rPr>
+          <w:i/>
+          <w:iCs/>
+          <w:lang w:val="en-US"/>
+        </w:rPr>
+        <w:t>wos_health_df</w:t>
+      </w:r>
+      <w:proofErr w:type="spellEnd"/>
+      <w:r>
+        <w:rPr>
+          <w:i/>
+          <w:iCs/>
+          <w:lang w:val="en-US"/>
+        </w:rPr>
+        <w:t xml:space="preserve">['Abstract'], </w:t>
+      </w:r>
+      <w:proofErr w:type="spellStart"/>
+      <w:r>
+        <w:rPr>
+          <w:i/>
+          <w:iCs/>
+          <w:lang w:val="en-US"/>
+        </w:rPr>
+        <w:t>wos_health_df</w:t>
+      </w:r>
+      <w:proofErr w:type="spellEnd"/>
+      <w:r>
+        <w:rPr>
+          <w:i/>
+          <w:iCs/>
+          <w:lang w:val="en-US"/>
+        </w:rPr>
+        <w:t xml:space="preserve">['Label'], </w:t>
+      </w:r>
+      <w:proofErr w:type="spellStart"/>
+      <w:r>
+        <w:rPr>
+          <w:i/>
+          <w:iCs/>
+          <w:lang w:val="en-US"/>
+        </w:rPr>
+        <w:t>test_size</w:t>
+      </w:r>
+      <w:proofErr w:type="spellEnd"/>
+      <w:r>
+        <w:rPr>
+          <w:i/>
+          <w:iCs/>
+          <w:lang w:val="en-US"/>
+        </w:rPr>
+        <w:t xml:space="preserve">=0.1, </w:t>
+      </w:r>
+      <w:proofErr w:type="spellStart"/>
+      <w:r>
+        <w:rPr>
+          <w:i/>
+          <w:iCs/>
+          <w:lang w:val="en-US"/>
+        </w:rPr>
+        <w:t>random_state</w:t>
+      </w:r>
+      <w:proofErr w:type="spellEnd"/>
+      <w:r>
+        <w:rPr>
+          <w:i/>
+          <w:iCs/>
+          <w:lang w:val="en-US"/>
+        </w:rPr>
+        <w:t>=42</w:t>
+      </w:r>
+    </w:p>
+    <w:p>
+      <w:pPr>
+        <w:rPr>
+          <w:i/>
+          <w:iCs/>
+          <w:lang w:val="en-US"/>
+        </w:rPr>
+      </w:pPr>
+      <w:r>
+        <w:rPr>
+          <w:i/>
+          <w:iCs/>
+          <w:lang w:val="en-US"/>
+        </w:rPr>
+        <w:t>)</w:t>
+      </w:r>
+    </w:p>
+    <w:p>
+      <w:pPr>
+        <w:rPr>
+          <w:i/>
+          <w:iCs/>
+          <w:lang w:val="en-US"/>
+        </w:rPr>
+      </w:pPr>
+    </w:p>
+    <w:p>
+      <w:pPr>
+        <w:rPr>
+          <w:i/>
+          <w:iCs/>
+          <w:lang w:val="en-US"/>
+        </w:rPr>
+      </w:pPr>
+      <w:r>
+        <w:rPr>
+          <w:i/>
+          <w:iCs/>
+          <w:lang w:val="en-US"/>
+        </w:rPr>
+        <w:t># SMOTE parameterizations</w:t>
+      </w:r>
+    </w:p>
+    <w:p>
+      <w:pPr>
+        <w:rPr>
+          <w:i/>
+          <w:iCs/>
+          <w:lang w:val="en-US"/>
+        </w:rPr>
+      </w:pPr>
+      <w:r>
+        <w:rPr>
+          <w:i/>
+          <w:iCs/>
+          <w:lang w:val="en-US"/>
+        </w:rPr>
+        <w:t xml:space="preserve">smote = </w:t>
+      </w:r>
+      <w:proofErr w:type="gramStart"/>
+      <w:r>
+        <w:rPr>
+          <w:i/>
+          <w:iCs/>
+          <w:lang w:val="en-US"/>
+        </w:rPr>
+        <w:t>SMOTE(</w:t>
+      </w:r>
+      <w:proofErr w:type="gramEnd"/>
+    </w:p>
+    <w:p>
+      <w:pPr>
+        <w:rPr>
+          <w:i/>
+          <w:iCs/>
+          <w:lang w:val="en-US"/>
+        </w:rPr>
+      </w:pPr>
+      <w:r>
+        <w:rPr>
+          <w:i/>
+          <w:iCs/>
+          <w:lang w:val="en-US"/>
+        </w:rPr>
+        <w:t xml:space="preserve">    </w:t>
+      </w:r>
+      <w:proofErr w:type="spellStart"/>
+      <w:r>
+        <w:rPr>
+          <w:i/>
+          <w:iCs/>
+          <w:lang w:val="en-US"/>
+        </w:rPr>
+        <w:t>sampling_strategy</w:t>
+      </w:r>
+      <w:proofErr w:type="spellEnd"/>
+      <w:r>
+        <w:rPr>
+          <w:i/>
+          <w:iCs/>
+          <w:lang w:val="en-US"/>
+        </w:rPr>
+        <w:t>='auto</w:t>
+      </w:r>
+      <w:proofErr w:type="gramStart"/>
+      <w:r>
+        <w:rPr>
+          <w:i/>
+          <w:iCs/>
+          <w:lang w:val="en-US"/>
+        </w:rPr>
+        <w:t>',  #</w:t>
+      </w:r>
+      <w:proofErr w:type="gramEnd"/>
+      <w:r>
+        <w:rPr>
+          <w:i/>
+          <w:iCs/>
+          <w:lang w:val="en-US"/>
+        </w:rPr>
+        <w:t xml:space="preserve"> Can be a float, str, </w:t>
+      </w:r>
+      <w:proofErr w:type="spellStart"/>
+      <w:r>
+        <w:rPr>
+          <w:i/>
+          <w:iCs/>
+          <w:lang w:val="en-US"/>
+        </w:rPr>
+        <w:t>dict</w:t>
+      </w:r>
+      <w:proofErr w:type="spellEnd"/>
+      <w:r>
+        <w:rPr>
+          <w:i/>
+          <w:iCs/>
+          <w:lang w:val="en-US"/>
+        </w:rPr>
+        <w:t>, or callable</w:t>
+      </w:r>
+    </w:p>
+    <w:p>
+      <w:pPr>
+        <w:rPr>
+          <w:i/>
+          <w:iCs/>
+          <w:lang w:val="en-US"/>
+        </w:rPr>
+      </w:pPr>
+      <w:r>
+        <w:rPr>
+          <w:i/>
+          <w:iCs/>
+          <w:lang w:val="en-US"/>
+        </w:rPr>
+        <w:t xml:space="preserve">    </w:t>
+      </w:r>
+      <w:proofErr w:type="spellStart"/>
+      <w:r>
+        <w:rPr>
+          <w:i/>
+          <w:iCs/>
+          <w:lang w:val="en-US"/>
+        </w:rPr>
+        <w:t>random_state</w:t>
+      </w:r>
+      <w:proofErr w:type="spellEnd"/>
+      <w:r>
+        <w:rPr>
+          <w:i/>
+          <w:iCs/>
+          <w:lang w:val="en-US"/>
+        </w:rPr>
+        <w:t>=</w:t>
+      </w:r>
+      <w:proofErr w:type="gramStart"/>
+      <w:r>
+        <w:rPr>
+          <w:i/>
+          <w:iCs/>
+          <w:lang w:val="en-US"/>
+        </w:rPr>
+        <w:t>42,  #</w:t>
+      </w:r>
+      <w:proofErr w:type="gramEnd"/>
+      <w:r>
+        <w:rPr>
+          <w:i/>
+          <w:iCs/>
+          <w:lang w:val="en-US"/>
+        </w:rPr>
+        <w:t xml:space="preserve"> Controls the randomness</w:t>
+      </w:r>
+    </w:p>
+    <w:p>
+      <w:pPr>
+        <w:rPr>
+          <w:i/>
+          <w:iCs/>
+          <w:lang w:val="en-US"/>
+        </w:rPr>
+      </w:pPr>
+      <w:r>
+        <w:rPr>
+          <w:i/>
+          <w:iCs/>
+          <w:lang w:val="en-US"/>
+        </w:rPr>
+        <w:t xml:space="preserve">    </w:t>
+      </w:r>
+      <w:proofErr w:type="spellStart"/>
+      <w:r>
+        <w:rPr>
+          <w:i/>
+          <w:iCs/>
+          <w:lang w:val="en-US"/>
+        </w:rPr>
+        <w:t>k_neighbors</w:t>
+      </w:r>
+      <w:proofErr w:type="spellEnd"/>
+      <w:r>
+        <w:rPr>
+          <w:i/>
+          <w:iCs/>
+          <w:lang w:val="en-US"/>
+        </w:rPr>
+        <w:t>=</w:t>
+      </w:r>
+      <w:proofErr w:type="gramStart"/>
+      <w:r>
+        <w:rPr>
+          <w:i/>
+          <w:iCs/>
+          <w:lang w:val="en-US"/>
+        </w:rPr>
+        <w:t>5,  #</w:t>
+      </w:r>
+      <w:proofErr w:type="gramEnd"/>
+      <w:r>
+        <w:rPr>
+          <w:i/>
+          <w:iCs/>
+          <w:lang w:val="en-US"/>
+        </w:rPr>
+        <w:t xml:space="preserve"> Number of nearest neighbors</w:t>
+      </w:r>
+    </w:p>
+    <w:p>
+      <w:pPr>
+        <w:rPr>
+          <w:i/>
+          <w:iCs/>
+          <w:lang w:val="en-US"/>
+        </w:rPr>
+      </w:pPr>
+      <w:r>
+        <w:rPr>
+          <w:i/>
+          <w:iCs/>
+          <w:lang w:val="en-US"/>
+        </w:rPr>
+        <w:t xml:space="preserve">    </w:t>
+      </w:r>
+      <w:proofErr w:type="spellStart"/>
+      <w:r>
+        <w:rPr>
+          <w:i/>
+          <w:iCs/>
+          <w:lang w:val="en-US"/>
+        </w:rPr>
+        <w:t>n_jobs</w:t>
+      </w:r>
+      <w:proofErr w:type="spellEnd"/>
+      <w:r>
+        <w:rPr>
+          <w:i/>
+          <w:iCs/>
+          <w:lang w:val="en-US"/>
+        </w:rPr>
+        <w:t>= -</w:t>
+      </w:r>
+      <w:proofErr w:type="gramStart"/>
+      <w:r>
+        <w:rPr>
+          <w:i/>
+          <w:iCs/>
+          <w:lang w:val="en-US"/>
+        </w:rPr>
+        <w:t>1  #</w:t>
+      </w:r>
+      <w:proofErr w:type="gramEnd"/>
+      <w:r>
+        <w:rPr>
+          <w:i/>
+          <w:iCs/>
+          <w:lang w:val="en-US"/>
+        </w:rPr>
+        <w:t xml:space="preserve"> Number of CPU cores used during the sampling (-1 means using all processors)</w:t>
+      </w:r>
+    </w:p>
+    <w:p>
+      <w:pPr>
+        <w:rPr>
+          <w:i/>
+          <w:iCs/>
+          <w:lang w:val="en-US"/>
+        </w:rPr>
+      </w:pPr>
+      <w:r>
+        <w:rPr>
+          <w:i/>
+          <w:iCs/>
+          <w:lang w:val="en-US"/>
+        </w:rPr>
+        <w:t>)</w:t>
+      </w:r>
+    </w:p>
+    <w:p>
+      <w:pPr>
+        <w:rPr>
+          <w:i/>
+          <w:iCs/>
+          <w:lang w:val="en-US"/>
+        </w:rPr>
+      </w:pPr>
+    </w:p>
+    <w:p>
+      <w:pPr>
+        <w:rPr>
+          <w:i/>
+          <w:iCs/>
+          <w:lang w:val="en-US"/>
+        </w:rPr>
+      </w:pPr>
+      <w:r>
+        <w:rPr>
+          <w:i/>
+          <w:iCs/>
+          <w:lang w:val="en-US"/>
+        </w:rPr>
+        <w:t xml:space="preserve"># Create a TF-IDF vectorizer and logistic regression pipeline with </w:t>
+      </w:r>
+      <w:proofErr w:type="spellStart"/>
+      <w:r>
+        <w:rPr>
+          <w:i/>
+          <w:iCs/>
+          <w:lang w:val="en-US"/>
+        </w:rPr>
+        <w:t>class_weight</w:t>
+      </w:r>
+      <w:proofErr w:type="spellEnd"/>
+      <w:r>
+        <w:rPr>
+          <w:i/>
+          <w:iCs/>
+          <w:lang w:val="en-US"/>
+        </w:rPr>
+        <w:t>='balanced' and SMOTE</w:t>
+      </w:r>
+    </w:p>
+    <w:p>
+      <w:pPr>
+        <w:rPr>
+          <w:i/>
+          <w:iCs/>
+          <w:lang w:val="en-US"/>
+        </w:rPr>
+      </w:pPr>
+      <w:r>
+        <w:rPr>
+          <w:i/>
+          <w:iCs/>
+          <w:lang w:val="en-US"/>
+        </w:rPr>
+        <w:t xml:space="preserve">model = </w:t>
+      </w:r>
+      <w:proofErr w:type="spellStart"/>
+      <w:r>
+        <w:rPr>
+          <w:i/>
+          <w:iCs/>
+          <w:lang w:val="en-US"/>
+        </w:rPr>
+        <w:t>make_pipeline_</w:t>
+      </w:r>
+      <w:proofErr w:type="gramStart"/>
+      <w:r>
+        <w:rPr>
+          <w:i/>
+          <w:iCs/>
+          <w:lang w:val="en-US"/>
+        </w:rPr>
+        <w:t>imb</w:t>
+      </w:r>
+      <w:proofErr w:type="spellEnd"/>
+      <w:r>
+        <w:rPr>
+          <w:i/>
+          <w:iCs/>
+          <w:lang w:val="en-US"/>
+        </w:rPr>
+        <w:t>(</w:t>
+      </w:r>
+      <w:proofErr w:type="gramEnd"/>
+    </w:p>
+    <w:p>
+      <w:pPr>
+        <w:rPr>
+          <w:i/>
+          <w:iCs/>
+          <w:lang w:val="en-US"/>
+        </w:rPr>
+      </w:pPr>
+      <w:r>
+        <w:rPr>
+          <w:i/>
+          <w:iCs/>
+          <w:lang w:val="en-US"/>
+        </w:rPr>
+        <w:t xml:space="preserve">    </w:t>
+      </w:r>
+      <w:proofErr w:type="spellStart"/>
+      <w:r>
+        <w:rPr>
+          <w:i/>
+          <w:iCs/>
+          <w:lang w:val="en-US"/>
+        </w:rPr>
+        <w:t>TfidfVectorizer</w:t>
+      </w:r>
+      <w:proofErr w:type="spellEnd"/>
+      <w:r>
+        <w:rPr>
+          <w:i/>
+          <w:iCs/>
+          <w:lang w:val="en-US"/>
+        </w:rPr>
+        <w:t>(</w:t>
+      </w:r>
+      <w:proofErr w:type="spellStart"/>
+      <w:r>
+        <w:rPr>
+          <w:i/>
+          <w:iCs/>
+          <w:lang w:val="en-US"/>
+        </w:rPr>
+        <w:t>stop_words</w:t>
+      </w:r>
+      <w:proofErr w:type="spellEnd"/>
+      <w:r>
+        <w:rPr>
+          <w:i/>
+          <w:iCs/>
+          <w:lang w:val="en-US"/>
+        </w:rPr>
+        <w:t>='</w:t>
+      </w:r>
+      <w:proofErr w:type="spellStart"/>
+      <w:r>
+        <w:rPr>
+          <w:i/>
+          <w:iCs/>
+          <w:lang w:val="en-US"/>
+        </w:rPr>
+        <w:t>english</w:t>
+      </w:r>
+      <w:proofErr w:type="spellEnd"/>
+      <w:r>
+        <w:rPr>
+          <w:i/>
+          <w:iCs/>
+          <w:lang w:val="en-US"/>
+        </w:rPr>
+        <w:t>'),</w:t>
+      </w:r>
+    </w:p>
+    <w:p>
+      <w:pPr>
+        <w:rPr>
+          <w:i/>
+          <w:iCs/>
+          <w:lang w:val="en-US"/>
+        </w:rPr>
+      </w:pPr>
+      <w:r>
+        <w:rPr>
+          <w:i/>
+          <w:iCs/>
+          <w:lang w:val="en-US"/>
+        </w:rPr>
+        <w:t xml:space="preserve">    </w:t>
+      </w:r>
+      <w:proofErr w:type="gramStart"/>
+      <w:r>
+        <w:rPr>
+          <w:i/>
+          <w:iCs/>
+          <w:lang w:val="en-US"/>
+        </w:rPr>
+        <w:t>smote,  #</w:t>
+      </w:r>
+      <w:proofErr w:type="gramEnd"/>
+      <w:r>
+        <w:rPr>
+          <w:i/>
+          <w:iCs/>
+          <w:lang w:val="en-US"/>
+        </w:rPr>
+        <w:t xml:space="preserve"> Use the SMOTE instance here</w:t>
+      </w:r>
+    </w:p>
+    <w:p>
+      <w:pPr>
+        <w:rPr>
+          <w:i/>
+          <w:iCs/>
+          <w:lang w:val="en-US"/>
+        </w:rPr>
+      </w:pPr>
+      <w:r>
+        <w:rPr>
+          <w:i/>
+          <w:iCs/>
+          <w:lang w:val="en-US"/>
+        </w:rPr>
+        <w:t xml:space="preserve">    </w:t>
+      </w:r>
+      <w:proofErr w:type="spellStart"/>
+      <w:proofErr w:type="gramStart"/>
+      <w:r>
+        <w:rPr>
+          <w:i/>
+          <w:iCs/>
+          <w:lang w:val="en-US"/>
+        </w:rPr>
+        <w:t>LogisticRegression</w:t>
+      </w:r>
+      <w:proofErr w:type="spellEnd"/>
+      <w:r>
+        <w:rPr>
+          <w:i/>
+          <w:iCs/>
+          <w:lang w:val="en-US"/>
+        </w:rPr>
+        <w:t>(</w:t>
+      </w:r>
+      <w:proofErr w:type="spellStart"/>
+      <w:proofErr w:type="gramEnd"/>
+      <w:r>
+        <w:rPr>
+          <w:i/>
+          <w:iCs/>
+          <w:lang w:val="en-US"/>
+        </w:rPr>
+        <w:t>random_state</w:t>
+      </w:r>
+      <w:proofErr w:type="spellEnd"/>
+      <w:r>
+        <w:rPr>
+          <w:i/>
+          <w:iCs/>
+          <w:lang w:val="en-US"/>
+        </w:rPr>
+        <w:t xml:space="preserve">=42, </w:t>
+      </w:r>
+      <w:proofErr w:type="spellStart"/>
+      <w:r>
+        <w:rPr>
+          <w:i/>
+          <w:iCs/>
+          <w:lang w:val="en-US"/>
+        </w:rPr>
+        <w:t>class_weight</w:t>
+      </w:r>
+      <w:proofErr w:type="spellEnd"/>
+      <w:r>
+        <w:rPr>
+          <w:i/>
+          <w:iCs/>
+          <w:lang w:val="en-US"/>
+        </w:rPr>
+        <w:t>='balanced')</w:t>
+      </w:r>
+    </w:p>
+    <w:p>
+      <w:pPr>
+        <w:rPr>
+          <w:i/>
+          <w:iCs/>
+          <w:lang w:val="en-US"/>
+        </w:rPr>
+      </w:pPr>
+      <w:r>
+        <w:rPr>
+          <w:i/>
+          <w:iCs/>
+          <w:lang w:val="en-US"/>
+        </w:rPr>
+        <w:t>)</w:t>
+      </w:r>
+    </w:p>
+    <w:p>
+      <w:pPr>
+        <w:rPr>
+          <w:i/>
+          <w:iCs/>
+          <w:lang w:val="en-US"/>
+        </w:rPr>
+      </w:pPr>
+    </w:p>
+    <w:p>
+      <w:pPr>
+        <w:rPr>
+          <w:i/>
+          <w:iCs/>
+          <w:lang w:val="en-US"/>
+        </w:rPr>
+      </w:pPr>
+      <w:r>
+        <w:rPr>
+          <w:i/>
+          <w:iCs/>
+          <w:lang w:val="en-US"/>
+        </w:rPr>
+        <w:t># Train the model</w:t>
+      </w:r>
+    </w:p>
+    <w:p>
+      <w:pPr>
+        <w:rPr>
+          <w:i/>
+          <w:iCs/>
+          <w:lang w:val="en-US"/>
+        </w:rPr>
+      </w:pPr>
+      <w:proofErr w:type="spellStart"/>
+      <w:proofErr w:type="gramStart"/>
+      <w:r>
+        <w:rPr>
+          <w:i/>
+          <w:iCs/>
+          <w:lang w:val="en-US"/>
+        </w:rPr>
+        <w:t>model.fit</w:t>
+      </w:r>
+      <w:proofErr w:type="spellEnd"/>
+      <w:r>
+        <w:rPr>
+          <w:i/>
+          <w:iCs/>
+          <w:lang w:val="en-US"/>
+        </w:rPr>
+        <w:t>(</w:t>
+      </w:r>
+      <w:proofErr w:type="spellStart"/>
+      <w:proofErr w:type="gramEnd"/>
+      <w:r>
+        <w:rPr>
+          <w:i/>
+          <w:iCs/>
+          <w:lang w:val="en-US"/>
+        </w:rPr>
+        <w:t>X_train</w:t>
+      </w:r>
+      <w:proofErr w:type="spellEnd"/>
+      <w:r>
+        <w:rPr>
+          <w:i/>
+          <w:iCs/>
+          <w:lang w:val="en-US"/>
+        </w:rPr>
+        <w:t xml:space="preserve">, </w:t>
+      </w:r>
+      <w:proofErr w:type="spellStart"/>
+      <w:r>
+        <w:rPr>
+          <w:i/>
+          <w:iCs/>
+          <w:lang w:val="en-US"/>
+        </w:rPr>
+        <w:t>y_train</w:t>
+      </w:r>
+      <w:proofErr w:type="spellEnd"/>
+      <w:r>
+        <w:rPr>
+          <w:i/>
+          <w:iCs/>
+          <w:lang w:val="en-US"/>
+        </w:rPr>
+        <w:t>)</w:t>
+      </w:r>
+    </w:p>
+    <w:p>
+      <w:pPr>
+        <w:rPr>
+          <w:i/>
+          <w:iCs/>
+          <w:lang w:val="en-US"/>
+        </w:rPr>
+      </w:pPr>
+    </w:p>
+    <w:p>
+      <w:pPr>
+        <w:rPr>
+          <w:i/>
+          <w:iCs/>
+          <w:lang w:val="en-US"/>
+        </w:rPr>
+      </w:pPr>
+      <w:r>
+        <w:rPr>
+          <w:i/>
+          <w:iCs/>
+          <w:lang w:val="en-US"/>
+        </w:rPr>
+        <w:t># Predict on the test set and evaluate</w:t>
+      </w:r>
+    </w:p>
+    <w:p>
+      <w:pPr>
+        <w:rPr>
+          <w:i/>
+          <w:iCs/>
+          <w:lang w:val="en-US"/>
+        </w:rPr>
+      </w:pPr>
+      <w:proofErr w:type="spellStart"/>
+      <w:r>
+        <w:rPr>
+          <w:i/>
+          <w:iCs/>
+          <w:lang w:val="en-US"/>
+        </w:rPr>
+        <w:t>y_pred</w:t>
+      </w:r>
+      <w:proofErr w:type="spellEnd"/>
+      <w:r>
+        <w:rPr>
+          <w:i/>
+          <w:iCs/>
+          <w:lang w:val="en-US"/>
+        </w:rPr>
+        <w:t xml:space="preserve"> = </w:t>
+      </w:r>
+      <w:proofErr w:type="spellStart"/>
+      <w:proofErr w:type="gramStart"/>
+      <w:r>
+        <w:rPr>
+          <w:i/>
+          <w:iCs/>
+          <w:lang w:val="en-US"/>
+        </w:rPr>
+        <w:t>model.predict</w:t>
+      </w:r>
+      <w:proofErr w:type="spellEnd"/>
+      <w:proofErr w:type="gramEnd"/>
+      <w:r>
+        <w:rPr>
+          <w:i/>
+          <w:iCs/>
+          <w:lang w:val="en-US"/>
+        </w:rPr>
+        <w:t>(</w:t>
+      </w:r>
+      <w:proofErr w:type="spellStart"/>
+      <w:r>
+        <w:rPr>
+          <w:i/>
+          <w:iCs/>
+          <w:lang w:val="en-US"/>
+        </w:rPr>
+        <w:t>X_test</w:t>
+      </w:r>
+      <w:proofErr w:type="spellEnd"/>
+      <w:r>
+        <w:rPr>
+          <w:i/>
+          <w:iCs/>
+          <w:lang w:val="en-US"/>
+        </w:rPr>
+        <w:t>)</w:t>
+      </w:r>
+    </w:p>
+    <w:p>
+      <w:pPr>
+        <w:rPr>
+          <w:i/>
+          <w:iCs/>
+          <w:lang w:val="en-US"/>
+        </w:rPr>
+      </w:pPr>
+      <w:proofErr w:type="gramStart"/>
+      <w:r>
+        <w:rPr>
+          <w:i/>
+          <w:iCs/>
+          <w:lang w:val="en-US"/>
+        </w:rPr>
+        <w:t>print(</w:t>
+      </w:r>
+      <w:proofErr w:type="spellStart"/>
+      <w:proofErr w:type="gramEnd"/>
+      <w:r>
+        <w:rPr>
+          <w:i/>
+          <w:iCs/>
+          <w:lang w:val="en-US"/>
+        </w:rPr>
+        <w:t>f"Accuracy</w:t>
+      </w:r>
+      <w:proofErr w:type="spellEnd"/>
+      <w:r>
+        <w:rPr>
+          <w:i/>
+          <w:iCs/>
+          <w:lang w:val="en-US"/>
+        </w:rPr>
+        <w:t>: {</w:t>
+      </w:r>
+      <w:proofErr w:type="spellStart"/>
+      <w:r>
+        <w:rPr>
+          <w:i/>
+          <w:iCs/>
+          <w:lang w:val="en-US"/>
+        </w:rPr>
+        <w:t>accuracy_</w:t>
+      </w:r>
+      <w:proofErr w:type="gramStart"/>
+      <w:r>
+        <w:rPr>
+          <w:i/>
+          <w:iCs/>
+          <w:lang w:val="en-US"/>
+        </w:rPr>
+        <w:t>score</w:t>
+      </w:r>
+      <w:proofErr w:type="spellEnd"/>
+      <w:r>
+        <w:rPr>
+          <w:i/>
+          <w:iCs/>
+          <w:lang w:val="en-US"/>
+        </w:rPr>
+        <w:t>(</w:t>
+      </w:r>
+      <w:proofErr w:type="spellStart"/>
+      <w:proofErr w:type="gramEnd"/>
+      <w:r>
+        <w:rPr>
+          <w:i/>
+          <w:iCs/>
+          <w:lang w:val="en-US"/>
+        </w:rPr>
+        <w:t>y_test</w:t>
+      </w:r>
+      <w:proofErr w:type="spellEnd"/>
+      <w:r>
+        <w:rPr>
+          <w:i/>
+          <w:iCs/>
+          <w:lang w:val="en-US"/>
+        </w:rPr>
+        <w:t xml:space="preserve">, </w:t>
+      </w:r>
+      <w:proofErr w:type="spellStart"/>
+      <w:r>
+        <w:rPr>
+          <w:i/>
+          <w:iCs/>
+          <w:lang w:val="en-US"/>
+        </w:rPr>
+        <w:t>y_pred</w:t>
+      </w:r>
+      <w:proofErr w:type="spellEnd"/>
+      <w:r>
+        <w:rPr>
+          <w:i/>
+          <w:iCs/>
+          <w:lang w:val="en-US"/>
+        </w:rPr>
+        <w:t>)}")</w:t>
+      </w:r>
+    </w:p>
+    <w:p>
+      <w:pPr>
+        <w:rPr>
+          <w:i/>
+          <w:iCs/>
+          <w:lang w:val="en-US"/>
+        </w:rPr>
+      </w:pPr>
+      <w:proofErr w:type="gramStart"/>
+      <w:r>
+        <w:rPr>
+          <w:i/>
+          <w:iCs/>
+          <w:lang w:val="en-US"/>
+        </w:rPr>
+        <w:t>print(</w:t>
+      </w:r>
+      <w:proofErr w:type="spellStart"/>
+      <w:proofErr w:type="gramEnd"/>
+      <w:r>
+        <w:rPr>
+          <w:i/>
+          <w:iCs/>
+          <w:lang w:val="en-US"/>
+        </w:rPr>
+        <w:t>classification_</w:t>
+      </w:r>
+      <w:proofErr w:type="gramStart"/>
+      <w:r>
+        <w:rPr>
+          <w:i/>
+          <w:iCs/>
+          <w:lang w:val="en-US"/>
+        </w:rPr>
+        <w:t>report</w:t>
+      </w:r>
+      <w:proofErr w:type="spellEnd"/>
+      <w:r>
+        <w:rPr>
+          <w:i/>
+          <w:iCs/>
+          <w:lang w:val="en-US"/>
+        </w:rPr>
+        <w:t>(</w:t>
+      </w:r>
+      <w:proofErr w:type="spellStart"/>
+      <w:proofErr w:type="gramEnd"/>
+      <w:r>
+        <w:rPr>
+          <w:i/>
+          <w:iCs/>
+          <w:lang w:val="en-US"/>
+        </w:rPr>
+        <w:t>y_test</w:t>
+      </w:r>
+      <w:proofErr w:type="spellEnd"/>
+      <w:r>
+        <w:rPr>
+          <w:i/>
+          <w:iCs/>
+          <w:lang w:val="en-US"/>
+        </w:rPr>
+        <w:t xml:space="preserve">, </w:t>
+      </w:r>
+      <w:proofErr w:type="spellStart"/>
+      <w:r>
+        <w:rPr>
+          <w:i/>
+          <w:iCs/>
+          <w:lang w:val="en-US"/>
+        </w:rPr>
+        <w:t>y_pred</w:t>
+      </w:r>
+      <w:proofErr w:type="spellEnd"/>
+      <w:r>
+        <w:rPr>
+          <w:i/>
+          <w:iCs/>
+          <w:lang w:val="en-US"/>
+        </w:rPr>
+        <w:t>))</w:t>
+      </w:r>
+    </w:p>
+    <w:p>
+      <w:pPr>
+        <w:rPr>
+          <w:i/>
+          <w:iCs/>
+          <w:lang w:val="en-US"/>
+        </w:rPr>
+      </w:pPr>
+    </w:p>
+    <w:p>
+      <w:pPr>
+        <w:rPr>
+          <w:i/>
+          <w:iCs/>
+          <w:lang w:val="en-US"/>
+        </w:rPr>
+      </w:pPr>
+      <w:r>
+        <w:rPr>
+          <w:i/>
+          <w:iCs/>
+          <w:lang w:val="en-US"/>
+        </w:rPr>
+        <w:t># Save the model</w:t>
+      </w:r>
+    </w:p>
+    <w:p>
+      <w:pPr>
+        <w:rPr>
+          <w:i/>
+          <w:iCs/>
+          <w:lang w:val="en-US"/>
+        </w:rPr>
+      </w:pPr>
+      <w:proofErr w:type="spellStart"/>
+      <w:r>
+        <w:rPr>
+          <w:i/>
+          <w:iCs/>
+          <w:lang w:val="en-US"/>
+        </w:rPr>
+        <w:t>model_path</w:t>
+      </w:r>
+      <w:proofErr w:type="spellEnd"/>
+      <w:r>
+        <w:rPr>
+          <w:i/>
+          <w:iCs/>
+          <w:lang w:val="en-US"/>
+        </w:rPr>
+        <w:t xml:space="preserve"> = "/Users/migueloliveira/Documents/Mig_projects/Synthetic_data_projects/Model HR_NHR/</w:t>
+      </w:r>
+      <w:proofErr w:type="spellStart"/>
+      <w:r>
+        <w:rPr>
+          <w:i/>
+          <w:iCs/>
+          <w:lang w:val="en-US"/>
+        </w:rPr>
+        <w:t>my_trained_model_Mig_review_with_SMOTE.joblib</w:t>
+      </w:r>
+      <w:proofErr w:type="spellEnd"/>
+      <w:r>
+        <w:rPr>
+          <w:i/>
+          <w:iCs/>
+          <w:lang w:val="en-US"/>
+        </w:rPr>
+        <w:t>"</w:t>
+      </w:r>
+    </w:p>
+    <w:p>
+      <w:pPr>
+        <w:rPr>
+          <w:i/>
+          <w:iCs/>
+          <w:lang w:val="en-US"/>
+        </w:rPr>
+      </w:pPr>
+      <w:proofErr w:type="gramStart"/>
+      <w:r>
+        <w:rPr>
+          <w:i/>
+          <w:iCs/>
+          <w:lang w:val="en-US"/>
+        </w:rPr>
+        <w:t>dump(</w:t>
+      </w:r>
+      <w:proofErr w:type="gramEnd"/>
+      <w:r>
+        <w:rPr>
+          <w:i/>
+          <w:iCs/>
+          <w:lang w:val="en-US"/>
+        </w:rPr>
+        <w:t xml:space="preserve">model, </w:t>
+      </w:r>
+      <w:proofErr w:type="spellStart"/>
+      <w:r>
+        <w:rPr>
+          <w:i/>
+          <w:iCs/>
+          <w:lang w:val="en-US"/>
+        </w:rPr>
+        <w:t>model_path</w:t>
+      </w:r>
+      <w:proofErr w:type="spellEnd"/>
+      <w:r>
+        <w:rPr>
+          <w:i/>
+          <w:iCs/>
+          <w:lang w:val="en-US"/>
+        </w:rPr>
+        <w:t>)</w:t>
+      </w:r>
+    </w:p>
+    <w:p>
+      <w:pPr>
+        <w:rPr>
+          <w:i/>
+          <w:iCs/>
+          <w:lang w:val="en-US"/>
+        </w:rPr>
+      </w:pPr>
+    </w:p>
+    <w:p>
+      <w:pPr>
+        <w:rPr>
+          <w:i/>
+          <w:iCs/>
+          <w:lang w:val="en-US"/>
+        </w:rPr>
+      </w:pPr>
+      <w:proofErr w:type="gramStart"/>
+      <w:r>
+        <w:rPr>
+          <w:i/>
+          <w:iCs/>
+          <w:lang w:val="en-US"/>
+        </w:rPr>
+        <w:t>print(</w:t>
+      </w:r>
+      <w:proofErr w:type="spellStart"/>
+      <w:proofErr w:type="gramEnd"/>
+      <w:r>
+        <w:rPr>
+          <w:i/>
+          <w:iCs/>
+          <w:lang w:val="en-US"/>
+        </w:rPr>
+        <w:t>f"Model</w:t>
+      </w:r>
+      <w:proofErr w:type="spellEnd"/>
+      <w:r>
+        <w:rPr>
+          <w:i/>
+          <w:iCs/>
+          <w:lang w:val="en-US"/>
+        </w:rPr>
+        <w:t xml:space="preserve"> saved to {</w:t>
+      </w:r>
+      <w:proofErr w:type="spellStart"/>
+      <w:r>
+        <w:rPr>
+          <w:i/>
+          <w:iCs/>
+          <w:lang w:val="en-US"/>
+        </w:rPr>
+        <w:t>model_path</w:t>
+      </w:r>
+      <w:proofErr w:type="spellEnd"/>
+      <w:r>
+        <w:rPr>
+          <w:i/>
+          <w:iCs/>
+          <w:lang w:val="en-US"/>
+        </w:rPr>
+        <w:t>}")</w:t>
+      </w:r>
+    </w:p>
+    <w:p>
+      <w:pPr>
+        <w:rPr>
+          <w:i/>
+          <w:iCs/>
+          <w:lang w:val="en-US"/>
+        </w:rPr>
+      </w:pPr>
+    </w:p>
+    <w:p>
+      <w:pPr>
+        <w:rPr>
+          <w:i/>
+          <w:iCs/>
+          <w:lang w:val="en-US"/>
+        </w:rPr>
+      </w:pPr>
+    </w:p>
     <w:sectPr>
       <w:pgSz w:w="11906" w:h="16838"/>
       <w:pgMar w:top="773" w:right="1701" w:bottom="607" w:left="1701" w:header="708" w:footer="708" w:gutter="0"/>
@@ -546,7 +2774,7 @@
 </file>
 
 <file path=word/styles.xml><?xml version="1.0" encoding="utf-8"?>
-<w:styles xmlns:mc="http://schemas.openxmlformats.org/markup-compatibility/2006" xmlns:r="http://schemas.openxmlformats.org/officeDocument/2006/relationships" xmlns:w="http://schemas.openxmlformats.org/wordprocessingml/2006/main" xmlns:w14="http://schemas.microsoft.com/office/word/2010/wordml" xmlns:w15="http://schemas.microsoft.com/office/word/2012/wordml" xmlns:w16cex="http://schemas.microsoft.com/office/word/2018/wordml/cex" xmlns:w16cid="http://schemas.microsoft.com/office/word/2016/wordml/cid" xmlns:w16="http://schemas.microsoft.com/office/word/2018/wordml" xmlns:w16du="http://schemas.microsoft.com/office/word/2023/wordml/word16du" xmlns:w16sdtdh="http://schemas.microsoft.com/office/word/2020/wordml/sdtdatahash" xmlns:w16se="http://schemas.microsoft.com/office/word/2015/wordml/symex" mc:Ignorable="w14 w15 w16se w16cid w16 w16cex w16sdtdh w16du">
+<w:styles xmlns:mc="http://schemas.openxmlformats.org/markup-compatibility/2006" xmlns:r="http://schemas.openxmlformats.org/officeDocument/2006/relationships" xmlns:w="http://schemas.openxmlformats.org/wordprocessingml/2006/main" xmlns:w14="http://schemas.microsoft.com/office/word/2010/wordml" xmlns:w15="http://schemas.microsoft.com/office/word/2012/wordml" xmlns:w16cex="http://schemas.microsoft.com/office/word/2018/wordml/cex" xmlns:w16cid="http://schemas.microsoft.com/office/word/2016/wordml/cid" xmlns:w16="http://schemas.microsoft.com/office/word/2018/wordml" xmlns:w16du="http://schemas.microsoft.com/office/word/2023/wordml/word16du" xmlns:w16sdtdh="http://schemas.microsoft.com/office/word/2020/wordml/sdtdatahash" xmlns:w16sdtfl="http://schemas.microsoft.com/office/word/2024/wordml/sdtformatlock" xmlns:w16se="http://schemas.microsoft.com/office/word/2015/wordml/symex" mc:Ignorable="w14 w15 w16se w16cid w16 w16cex w16sdtdh w16sdtfl w16du">
   <w:docDefaults>
     <w:rPrDefault>
       <w:rPr>

</xml_diff>